<commit_message>
fix(UD1): usar IA disponible (ChatGPT/Gemini/Copilot), aclarar tabla de huella y qué es una fuente (la IA no lo es)
</commit_message>
<xml_diff>
--- a/docs/practicas/UD1/Reto_ImpresionArte_UD1.docx
+++ b/docs/practicas/UD1/Reto_ImpresionArte_UD1.docx
@@ -51,7 +51,7 @@
           <w:i/>
           <w:color w:val="FF5722"/>
         </w:rPr>
-        <w:t>Aprendizaje Basado en Descubrimiento · Trabajo en grupo con Microsoft Copilot</w:t>
+        <w:t>Aprendizaje Basado en Descubrimiento · Trabajo en grupo con IA generativa</w:t>
       </w:r>
     </w:p>
     <w:p>
@@ -145,7 +145,7 @@
           </w:tcPr>
           <w:p>
             <w:r>
-              <w:t>Piloto de Copilot</w:t>
+              <w:t>Piloto de IA</w:t>
             </w:r>
           </w:p>
         </w:tc>
@@ -307,7 +307,7 @@
         <w:pStyle w:val="ListBullet"/>
       </w:pPr>
       <w:r>
-        <w:t>Usamos Microsoft Copilot como apoyo para investigar. La IA propone; vosotros decidís y justificáis.</w:t>
+        <w:t>Usamos una IA generativa (ChatGPT, Gemini o Copilot: la que tengáis) como apoyo. Indicad en el documento cuál usáis. La IA propone; vosotros decidís y justificáis.</w:t>
       </w:r>
     </w:p>
     <w:p>
@@ -337,7 +337,7 @@
         <w:rPr>
           <w:color w:val="3F51B5"/>
         </w:rPr>
-        <w:t>Bloque A — Exploración con Copilot</w:t>
+        <w:t>Bloque A — Exploración con la IA</w:t>
       </w:r>
     </w:p>
     <w:p>
@@ -346,7 +346,7 @@
           <w:b w:val="0"/>
           <w:i/>
         </w:rPr>
-        <w:t>Pedid a Copilot que analice el caso de ImpresiónArte y responded:</w:t>
+        <w:t>Pedid a vuestra IA que analice el caso de ImpresiónArte y responded:</w:t>
       </w:r>
     </w:p>
     <w:p>
@@ -362,7 +362,7 @@
         <w:pStyle w:val="ListNumber"/>
       </w:pPr>
       <w:r>
-        <w:t>¿Qué soluciones digitales propone Copilot?</w:t>
+        <w:t>¿Qué soluciones digitales propone la IA?</w:t>
       </w:r>
     </w:p>
     <w:p>
@@ -414,7 +414,7 @@
                 <w:b/>
                 <w:color w:val="FFFFFF"/>
               </w:rPr>
-              <w:t>Solución propuesta por Copilot</w:t>
+              <w:t>Solución propuesta por la IA</w:t>
             </w:r>
           </w:p>
         </w:tc>
@@ -527,7 +527,7 @@
           <w:b w:val="0"/>
           <w:i w:val="0"/>
         </w:rPr>
-        <w:t>Preguntad a Copilot la diferencia entre digitalizar y transformar digitalmente. Después, responded con vuestras palabras:</w:t>
+        <w:t>Preguntad a la IA la diferencia entre digitalizar y transformar digitalmente. Después, responded con vuestras palabras:</w:t>
       </w:r>
     </w:p>
     <w:p>
@@ -714,7 +714,7 @@
           <w:b w:val="0"/>
           <w:i w:val="0"/>
         </w:rPr>
-        <w:t>Preguntad a Copilot qué tipos de transformación digital existen y clasificad las soluciones del Bloque A según el tipo de cambio que suponen:</w:t>
+        <w:t>Preguntad a la IA qué tipos de transformación digital existen y clasificad las soluciones del Bloque A según el tipo de cambio que suponen:</w:t>
       </w:r>
     </w:p>
     <w:tbl>
@@ -939,7 +939,7 @@
           <w:b w:val="0"/>
           <w:i w:val="0"/>
         </w:rPr>
-        <w:t>Elegid una afirmación de Copilot (un precio, una herramienta, un dato) y contrastadla con una fuente real (web oficial, catálogo, noticia). Citad la fuente.</w:t>
+        <w:t>Elegid una afirmación de la IA (un precio, una herramienta, un dato) y contrastadla con una fuente real (web oficial, catálogo, noticia). Citad la fuente.</w:t>
       </w:r>
     </w:p>
     <w:tbl>
@@ -967,7 +967,7 @@
                 <w:b/>
                 <w:color w:val="FFFFFF"/>
               </w:rPr>
-              <w:t>Afirmación de Copilot</w:t>
+              <w:t>Afirmación de la IA</w:t>
             </w:r>
           </w:p>
         </w:tc>
@@ -1034,10 +1034,20 @@
     <w:p>
       <w:r>
         <w:rPr>
+          <w:b w:val="0"/>
+          <w:i/>
+          <w:color w:val="FF5722"/>
+        </w:rPr>
+        <w:t>¿Qué es una fuente? La IA NO es una fuente: responde con su conocimiento y puede inventarse datos. Una fuente es un documento real que confirma el dato (web oficial, precio, noticia, dato oficial). Cita así: Web. "Título". URL (consultado el dd/mm/aaaa).</w:t>
+      </w:r>
+    </w:p>
+    <w:p>
+      <w:r>
+        <w:rPr>
           <w:b/>
           <w:i w:val="0"/>
         </w:rPr>
-        <w:t>Rellenad la tabla de huella (mínimo 3 propuestas):</w:t>
+        <w:t>Tabla de huella: es el registro de vuestras decisiones, no un resumen. En cada fila ponéis qué propuso la IA, si lo aceptáis (sí / no / en parte) y qué cambiáis y por qué. Si ponéis "sí" a todo, está mal: la IA siempre propone cosas que hay que matizar.</w:t>
       </w:r>
     </w:p>
     <w:tbl>
@@ -1673,7 +1683,7 @@
         <w:rPr>
           <w:color w:val="3F51B5"/>
         </w:rPr>
-        <w:t>5. Prompts que podéis usar en Copilot</w:t>
+        <w:t>5. Prompts que podéis usar en la IA</w:t>
       </w:r>
     </w:p>
     <w:p>
@@ -1709,7 +1719,7 @@
           <w:b w:val="0"/>
           <w:i/>
         </w:rPr>
-        <w:t>Prompt 4 — «¿Cuánto costaría aproximadamente [herramienta] para una empresa de 7 personas? ¿Qué alternativa gratuita o barata hay?»</w:t>
+        <w:t>Prompt 4 — «¿Cuánto costaría aproximadamente [herramienta] para una empresa de 7 personas? ¿Qué alternativa gratuita o barata hay? Dame también la web oficial donde comprobarlo.»</w:t>
       </w:r>
     </w:p>
     <w:p>
@@ -1720,31 +1730,34 @@
         <w:rPr>
           <w:color w:val="3F51B5"/>
         </w:rPr>
-        <w:t>6. Reglas anti-copia-pega</w:t>
+        <w:t>6. Uso crítico de la IA</w:t>
       </w:r>
     </w:p>
     <w:p>
-      <w:pPr>
-        <w:pStyle w:val="ListNumber"/>
-      </w:pPr>
       <w:r>
-        <w:t>La tabla de huella es obligatoria: sin ella, la actividad no se califica.</w:t>
+        <w:rPr>
+          <w:b w:val="0"/>
+          <w:i w:val="0"/>
+        </w:rPr>
+        <w:t>1. La tabla de huella es obligatoria: sin ella, la actividad no se califica.</w:t>
       </w:r>
     </w:p>
     <w:p>
-      <w:pPr>
-        <w:pStyle w:val="ListNumber"/>
-      </w:pPr>
       <w:r>
-        <w:t>Debéis contrastar al menos una afirmación de Copilot con una fuente real y citarla.</w:t>
+        <w:rPr>
+          <w:b w:val="0"/>
+          <w:i w:val="0"/>
+        </w:rPr>
+        <w:t>2. La IA no es una fuente. Debéis contrastar al menos una afirmación de la IA con una fuente real (web oficial, precio, noticia, dato oficial) y citarla.</w:t>
       </w:r>
     </w:p>
     <w:p>
-      <w:pPr>
-        <w:pStyle w:val="ListNumber"/>
-      </w:pPr>
       <w:r>
-        <w:t>La IA propone; el grupo decide y justifica con sus propias palabras.</w:t>
+        <w:rPr>
+          <w:b w:val="0"/>
+          <w:i w:val="0"/>
+        </w:rPr>
+        <w:t>3. La IA propone; el grupo decide y justifica con sus propias palabras.</w:t>
       </w:r>
     </w:p>
     <w:p>

</xml_diff>